<commit_message>
Lengthen leadership drafts towards the 800-word cap
Co-Authored-By: Claude Sonnet 5.5 <noreply@anthropic.com>
Claude-Session: https://claude.ai/code/session_01Vjm9Ahpvedd54aqkLcW9LV
</commit_message>
<xml_diff>
--- a/leadership/Leadership Reflection and Plan - Complete.docx
+++ b/leadership/Leadership Reflection and Plan - Complete.docx
@@ -60,7 +60,7 @@
           <w:rFonts w:ascii="Arial" w:hAnsi="Arial"/>
           <w:sz w:val="24"/>
         </w:rPr>
-        <w:t>In Goleman's (1998) terms, strong social skill without self-awareness means I influence people without checking how I come across. My default style resembled the affiliative one, which Goleman (2000) warns can avoid difficult conversations. It did not fit: the group needed challenge, not harmony. I also delegated tasks but kept the final say, which probably left teammates little room to speak. This framing has limits. Antonakis, Ashkanasy and Dasborough (2009) argue that emotional intelligence is poorly defined and measured, so my self-rating may depend on the model used.</w:t>
+        <w:t>In Goleman's (1998) terms, strong social skill without self-awareness means I influence people without checking how I come across. My default style resembled the affiliative one, which Goleman (2000) warns can avoid difficult conversations. It did not fit: the group needed challenge, not harmony, and my instinct is to smooth over disagreement instead of surfacing it. I also delegated tasks but kept the final say, which probably left teammates little room to speak. This framing has limits. Antonakis, Ashkanasy and Dasborough (2009) argue that emotional intelligence is poorly defined and measured, so my self-rating may depend on the model used.</w:t>
       </w:r>
     </w:p>
     <w:p>
@@ -155,7 +155,7 @@
           <w:rFonts w:ascii="Arial" w:hAnsi="Arial"/>
           <w:sz w:val="24"/>
         </w:rPr>
-        <w:t>I chose Nooyi, former PepsiCo chief executive, against three criteria: documented leadership philosophy (Nooyi, 2021); an intersectional position (gender, ethnicity, migration); and a record containing both achievement and criticism, which permits evaluation, not admiration. I rejected Nadella here to avoid overlap, and because gender does not apply to him.</w:t>
+        <w:t>I chose Nooyi, former PepsiCo chief executive, against three criteria: documented leadership philosophy (Nooyi, 2021); an intersectional position (gender, ethnicity, migration); and a record containing both achievement and criticism, which permits evaluation, not admiration. Her memoir is self-authored, so I will read it as advocacy as well as evidence. I rejected Nadella here to avoid overlap, and because gender does not apply to him.</w:t>
       </w:r>
     </w:p>
     <w:p>

</xml_diff>